<commit_message>
feat: diseño compacto, soporte de imágenes y control de versiones con Gemini
</commit_message>
<xml_diff>
--- a/source/Manua de Registro de Medicamentos en Tasy.docx
+++ b/source/Manua de Registro de Medicamentos en Tasy.docx
@@ -4,185 +4,97 @@
   <w:body>
     <w:p>
       <w:pPr>
-        <w:pBdr>
-          <w:bottom w:val="single" w:sz="6" w:space="1" w:color="auto"/>
-        </w:pBdr>
+        <w:pStyle w:val="Ttulo"/>
         <w:rPr>
           <w:b/>
           <w:bCs/>
-          <w:color w:val="004F88"/>
+          <w:sz w:val="96"/>
+          <w:szCs w:val="96"/>
+        </w:rPr>
+      </w:pPr>
+      <w:r>
+        <w:rPr>
+          <w:b/>
+          <w:bCs/>
+          <w:sz w:val="96"/>
+          <w:szCs w:val="96"/>
+        </w:rPr>
+        <w:t>Manual de Registro de Medicamentos en TASY</w:t>
+      </w:r>
+    </w:p>
+    <w:p>
+      <w:pPr>
+        <w:pStyle w:val="Subttulo"/>
+      </w:pPr>
+      <w:r>
+        <w:t>Versión 1.0</w:t>
+      </w:r>
+    </w:p>
+    <w:p>
+      <w:pPr>
+        <w:pStyle w:val="Subttulo"/>
+        <w:rPr>
+          <w:b/>
+          <w:bCs/>
           <w:sz w:val="144"/>
           <w:szCs w:val="144"/>
         </w:rPr>
       </w:pPr>
       <w:r>
-        <w:rPr>
-          <w:b/>
-          <w:bCs/>
-          <w:color w:val="004F88"/>
-          <w:sz w:val="144"/>
-          <w:szCs w:val="144"/>
-        </w:rPr>
-        <w:t xml:space="preserve">Manual de Registro de Medicamentos </w:t>
-      </w:r>
-      <w:r>
-        <w:rPr>
-          <w:b/>
-          <w:bCs/>
-          <w:color w:val="004F88"/>
-          <w:sz w:val="144"/>
-          <w:szCs w:val="144"/>
-        </w:rPr>
-        <w:t>en TASY</w:t>
-      </w:r>
-    </w:p>
-    <w:p>
-      <w:pPr>
-        <w:rPr>
-          <w:color w:val="004F88"/>
-        </w:rPr>
-      </w:pPr>
-      <w:r>
-        <w:rPr>
-          <w:color w:val="004F88"/>
-        </w:rPr>
-        <w:t xml:space="preserve">Creado el: </w:t>
-      </w:r>
-    </w:p>
-    <w:p>
-      <w:pPr>
-        <w:pBdr>
-          <w:bottom w:val="single" w:sz="6" w:space="1" w:color="auto"/>
-        </w:pBdr>
-        <w:rPr>
-          <w:color w:val="004F88"/>
-        </w:rPr>
-      </w:pPr>
-      <w:r>
-        <w:rPr>
-          <w:color w:val="004F88"/>
-        </w:rPr>
-        <w:t>Ultima modificación:</w:t>
-      </w:r>
-    </w:p>
-    <w:p>
-      <w:pPr>
-        <w:pBdr>
-          <w:bottom w:val="single" w:sz="6" w:space="1" w:color="auto"/>
-        </w:pBdr>
-        <w:rPr>
-          <w:color w:val="004F88"/>
-        </w:rPr>
-      </w:pPr>
-    </w:p>
-    <w:p>
-      <w:pPr>
-        <w:pBdr>
-          <w:bottom w:val="single" w:sz="6" w:space="1" w:color="auto"/>
-        </w:pBdr>
-        <w:rPr>
-          <w:color w:val="004F88"/>
-        </w:rPr>
-      </w:pPr>
-    </w:p>
-    <w:p>
-      <w:pPr>
-        <w:pBdr>
-          <w:bottom w:val="single" w:sz="6" w:space="1" w:color="auto"/>
-        </w:pBdr>
-        <w:rPr>
-          <w:color w:val="004F88"/>
-        </w:rPr>
-      </w:pPr>
-    </w:p>
-    <w:p>
-      <w:pPr>
-        <w:pBdr>
-          <w:bottom w:val="single" w:sz="6" w:space="1" w:color="auto"/>
-        </w:pBdr>
-        <w:rPr>
-          <w:color w:val="004F88"/>
-        </w:rPr>
-      </w:pPr>
-    </w:p>
-    <w:p>
-      <w:pPr>
-        <w:pBdr>
-          <w:bottom w:val="single" w:sz="6" w:space="1" w:color="auto"/>
-        </w:pBdr>
-        <w:rPr>
-          <w:color w:val="004F88"/>
-        </w:rPr>
-      </w:pPr>
-    </w:p>
-    <w:p>
-      <w:pPr>
-        <w:pBdr>
-          <w:bottom w:val="single" w:sz="6" w:space="1" w:color="auto"/>
-        </w:pBdr>
-        <w:rPr>
-          <w:color w:val="004F88"/>
-        </w:rPr>
-      </w:pPr>
-    </w:p>
-    <w:p>
-      <w:pPr>
-        <w:jc w:val="center"/>
-        <w:rPr>
-          <w:color w:val="004F88"/>
-        </w:rPr>
-      </w:pPr>
-      <w:r>
-        <w:rPr>
-          <w:color w:val="004F88"/>
-        </w:rPr>
-        <w:t>Centro Médico ABC</w:t>
-      </w:r>
-    </w:p>
-    <w:p>
-      <w:pPr>
-        <w:jc w:val="center"/>
-        <w:sectPr>
-          <w:headerReference w:type="default" r:id="rId8"/>
-          <w:footerReference w:type="default" r:id="rId9"/>
-          <w:footerReference w:type="first" r:id="rId10"/>
-          <w:pgSz w:w="12240" w:h="15840"/>
-          <w:pgMar w:top="1440" w:right="1440" w:bottom="1440" w:left="1440" w:header="708" w:footer="708" w:gutter="0"/>
-          <w:cols w:space="708"/>
-          <w:titlePg/>
-          <w:docGrid w:linePitch="360"/>
-        </w:sectPr>
-      </w:pPr>
-    </w:p>
-    <w:p>
-      <w:pPr>
-        <w:jc w:val="center"/>
-      </w:pPr>
+        <w:t>Ú</w:t>
+      </w:r>
+      <w:r>
+        <w:t>ltima modificación</w:t>
+      </w:r>
+      <w:r>
+        <w:t xml:space="preserve"> el </w:t>
+      </w:r>
+      <w:r>
+        <w:t>26 de septiembre de 2026</w:t>
+      </w:r>
     </w:p>
     <w:p>
       <w:pPr>
         <w:pStyle w:val="Ttulo1"/>
-        <w:numPr>
-          <w:ilvl w:val="0"/>
-          <w:numId w:val="2"/>
-        </w:numPr>
+        <w:tabs>
+          <w:tab w:val="left" w:pos="6513"/>
+        </w:tabs>
       </w:pPr>
       <w:r>
         <w:t>Introducción</w:t>
       </w:r>
-    </w:p>
-    <w:p>
-      <w:r>
-        <w:t>El presente manual es una guía técnica para la configuración completa del catalogo de medicamentos para el Centro Médico ABC, sus flujos y reglas son propias de la institución, la versión de Tasy referenciada es 5.03.</w:t>
+      <w:r>
+        <w:tab/>
+      </w:r>
+    </w:p>
+    <w:p>
+      <w:r>
+        <w:t xml:space="preserve">El presente manual es una guía técnica para la configuración completa del </w:t>
+      </w:r>
+      <w:proofErr w:type="spellStart"/>
+      <w:r>
+        <w:t>catalogo</w:t>
+      </w:r>
+      <w:proofErr w:type="spellEnd"/>
+      <w:r>
+        <w:t xml:space="preserve"> de medicamentos para el Centro Médico ABC, sus flujos y reglas son propias de la institución, </w:t>
+      </w:r>
+      <w:r>
+        <w:t xml:space="preserve">con </w:t>
+      </w:r>
+      <w:r>
+        <w:t xml:space="preserve">Tasy </w:t>
+      </w:r>
+      <w:r>
+        <w:t xml:space="preserve">EMR </w:t>
+      </w:r>
+      <w:r>
+        <w:t>5.03.</w:t>
       </w:r>
     </w:p>
     <w:p>
       <w:pPr>
         <w:pStyle w:val="Ttulo2"/>
-        <w:numPr>
-          <w:ilvl w:val="1"/>
-          <w:numId w:val="2"/>
-        </w:numPr>
       </w:pPr>
       <w:bookmarkStart w:id="0" w:name="_¿Cómo_utilizar_este"/>
       <w:bookmarkEnd w:id="0"/>
@@ -217,19 +129,7 @@
           <w:rPr>
             <w:rStyle w:val="Hipervnculo"/>
           </w:rPr>
-          <w:t>hipervíncu</w:t>
-        </w:r>
-        <w:r>
-          <w:rPr>
-            <w:rStyle w:val="Hipervnculo"/>
-          </w:rPr>
-          <w:t>l</w:t>
-        </w:r>
-        <w:r>
-          <w:rPr>
-            <w:rStyle w:val="Hipervnculo"/>
-          </w:rPr>
-          <w:t>os</w:t>
+          <w:t>hipervínculos</w:t>
         </w:r>
       </w:hyperlink>
       <w:r>
@@ -238,28 +138,61 @@
     </w:p>
     <w:p>
       <w:pPr>
-        <w:jc w:val="right"/>
+        <w:pStyle w:val="Nota"/>
         <w:rPr>
           <w:rStyle w:val="nfasissutil"/>
+          <w:i w:val="0"/>
+          <w:iCs w:val="0"/>
+          <w:color w:val="auto"/>
         </w:rPr>
       </w:pPr>
       <w:r>
         <w:rPr>
           <w:rStyle w:val="nfasissutil"/>
+          <w:i w:val="0"/>
+          <w:iCs w:val="0"/>
+          <w:color w:val="auto"/>
         </w:rPr>
-        <w:t>Nota: LA información como notas aparece en cursiva al final de un bloque para incluir flujos alternos o configuraciones adicionales, así como algunas excepciones a las reglas generales</w:t>
-      </w:r>
-      <w:r>
+        <w:t>Nota: LA información como notas aparece en cursiva al final de un bloque para incluir flujos alternos o configuraciones adicionales, así como algunas excepciones a las reglas generales.</w:t>
+      </w:r>
+    </w:p>
+    <w:p>
+      <w:pPr>
+        <w:jc w:val="center"/>
+        <w:rPr>
+          <w:rStyle w:val="nfasis"/>
+        </w:rPr>
+      </w:pPr>
+    </w:p>
+    <w:p>
+      <w:pPr>
         <w:rPr>
           <w:rStyle w:val="nfasissutil"/>
+          <w:i w:val="0"/>
+          <w:iCs w:val="0"/>
         </w:rPr>
-        <w:t>.</w:t>
+      </w:pPr>
+      <w:r>
+        <w:rPr>
+          <w:rStyle w:val="nfasissutil"/>
+          <w:i w:val="0"/>
+          <w:iCs w:val="0"/>
+        </w:rPr>
+        <w:t>En el caso de necesitar nombrar algo importante:</w:t>
       </w:r>
     </w:p>
     <w:p>
       <w:pPr>
         <w:pStyle w:val="Importante"/>
       </w:pPr>
+      <w:r>
+        <w:rPr>
+          <w:rStyle w:val="nfasissutil"/>
+          <w:i w:val="0"/>
+          <w:iCs/>
+        </w:rPr>
+        <w:tab/>
+      </w:r>
       <w:r>
         <w:rPr>
           <w:rFonts w:ascii="Segoe UI Emoji" w:hAnsi="Segoe UI Emoji" w:cs="Segoe UI Emoji"/>
@@ -274,37 +207,50 @@
         <w:t>Importante</w:t>
       </w:r>
       <w:r>
-        <w:t>:</w:t>
+        <w:t>: Si una modificación es capaz de entorpecer o detener un flujo se encierra dentro de la casilla de importante</w:t>
+      </w:r>
+    </w:p>
+    <w:p>
+      <w:pPr>
+        <w:rPr>
+          <w:rStyle w:val="nfasissutil"/>
+          <w:i w:val="0"/>
+          <w:iCs w:val="0"/>
+        </w:rPr>
+      </w:pPr>
+      <w:r>
+        <w:rPr>
+          <w:rStyle w:val="nfasissutil"/>
+          <w:i w:val="0"/>
+          <w:iCs w:val="0"/>
+        </w:rPr>
+        <w:t>En el caso de las políticas</w:t>
+      </w:r>
+    </w:p>
+    <w:p>
+      <w:pPr>
+        <w:pStyle w:val="Politica"/>
+      </w:pPr>
+      <w:r>
+        <w:t>Política</w:t>
+      </w:r>
+      <w:r>
+        <w:t>: Las políticas del Centro Médico ABC tienen la importancia jerárquica más alta</w:t>
+      </w:r>
+      <w:r>
+        <w:t>,</w:t>
       </w:r>
       <w:r>
         <w:t xml:space="preserve"> </w:t>
       </w:r>
       <w:r>
-        <w:t>Si una modificación es capaz de entorpecer o detener un flujo se encierra dentro de la casilla de importante</w:t>
-      </w:r>
-    </w:p>
-    <w:p>
-      <w:pPr>
-        <w:pStyle w:val="Citadestacada"/>
-      </w:pPr>
-      <w:r>
-        <w:rPr>
-          <w:b/>
-          <w:bCs/>
-        </w:rPr>
-        <w:t>Política</w:t>
-      </w:r>
-      <w:r>
-        <w:t>: Las políticas del Centro Médico ABC tienen la importancia jerárquica más alta</w:t>
-      </w:r>
-      <w:r>
-        <w:t>,</w:t>
-      </w:r>
-      <w:r>
-        <w:t xml:space="preserve"> </w:t>
-      </w:r>
-      <w:r>
         <w:t>la mejor práctica es siempre consultar la versión más reciente.</w:t>
+      </w:r>
+    </w:p>
+    <w:p>
+      <w:r>
+        <w:lastRenderedPageBreak/>
+        <w:t>También tablas comparativas</w:t>
       </w:r>
     </w:p>
     <w:tbl>
@@ -457,11 +403,7 @@
     </w:tbl>
     <w:p>
       <w:pPr>
-        <w:pStyle w:val="Ttulo1"/>
-        <w:numPr>
-          <w:ilvl w:val="0"/>
-          <w:numId w:val="2"/>
-        </w:numPr>
+        <w:pStyle w:val="Ttulo2"/>
       </w:pPr>
       <w:r>
         <w:t>Arquitectura y Lógica del Sistema Tasy</w:t>
@@ -492,6 +434,9 @@
     <w:p>
       <w:r>
         <w:t>La interfaz gráfica de Tasy nos permite capturar esta información y reglas por medio de formularios dinámicos, la visión y edición de los mismos a su vez están controlados por la información del “Establecimiento”, “Perfil” y Sector”</w:t>
+      </w:r>
+      <w:r>
+        <w:t>.</w:t>
       </w:r>
     </w:p>
     <w:p>
@@ -506,6 +451,7 @@
       <w:r>
         <w:rPr>
           <w:rFonts w:asciiTheme="majorHAnsi" w:eastAsiaTheme="majorEastAsia" w:hAnsiTheme="majorHAnsi" w:cstheme="majorBidi"/>
+          <w:noProof/>
           <w:color w:val="2F5496" w:themeColor="accent1" w:themeShade="BF"/>
           <w:sz w:val="40"/>
           <w:szCs w:val="40"/>
@@ -526,7 +472,7 @@
                     <pic:cNvPicPr/>
                   </pic:nvPicPr>
                   <pic:blipFill>
-                    <a:blip r:embed="rId11"/>
+                    <a:blip r:embed="rId8"/>
                     <a:stretch>
                       <a:fillRect/>
                     </a:stretch>
@@ -549,11 +495,7 @@
     </w:p>
     <w:p>
       <w:pPr>
-        <w:pStyle w:val="Ttulo2"/>
-        <w:numPr>
-          <w:ilvl w:val="1"/>
-          <w:numId w:val="2"/>
-        </w:numPr>
+        <w:pStyle w:val="Ttulo3"/>
       </w:pPr>
       <w:r>
         <w:t>Funciones y Utilitarios</w:t>
@@ -566,6 +508,9 @@
     </w:p>
     <w:p>
       <w:r>
+        <w:rPr>
+          <w:noProof/>
+        </w:rPr>
         <w:drawing>
           <wp:inline distT="0" distB="0" distL="0" distR="0" wp14:anchorId="0219691D" wp14:editId="0CE5DCD3">
             <wp:extent cx="5943600" cy="1023620"/>
@@ -582,7 +527,7 @@
                     <pic:cNvPicPr/>
                   </pic:nvPicPr>
                   <pic:blipFill>
-                    <a:blip r:embed="rId12"/>
+                    <a:blip r:embed="rId9"/>
                     <a:stretch>
                       <a:fillRect/>
                     </a:stretch>
@@ -605,13 +550,10 @@
     </w:p>
     <w:p>
       <w:pPr>
-        <w:pStyle w:val="Ttulo2"/>
-        <w:numPr>
-          <w:ilvl w:val="1"/>
-          <w:numId w:val="2"/>
-        </w:numPr>
-      </w:pPr>
-      <w:r>
+        <w:pStyle w:val="Ttulo3"/>
+      </w:pPr>
+      <w:r>
+        <w:lastRenderedPageBreak/>
         <w:t>Registro de Materiales</w:t>
       </w:r>
     </w:p>
@@ -625,6 +567,9 @@
     </w:p>
     <w:p>
       <w:r>
+        <w:rPr>
+          <w:noProof/>
+        </w:rPr>
         <w:drawing>
           <wp:inline distT="0" distB="0" distL="0" distR="0" wp14:anchorId="5B434715" wp14:editId="07B82A40">
             <wp:extent cx="2219325" cy="800100"/>
@@ -641,7 +586,7 @@
                     <pic:cNvPicPr/>
                   </pic:nvPicPr>
                   <pic:blipFill rotWithShape="1">
-                    <a:blip r:embed="rId13"/>
+                    <a:blip r:embed="rId10"/>
                     <a:srcRect l="13122" r="6423"/>
                     <a:stretch>
                       <a:fillRect/>
@@ -681,11 +626,7 @@
     </w:p>
     <w:p>
       <w:pPr>
-        <w:pStyle w:val="Ttulo1"/>
-        <w:numPr>
-          <w:ilvl w:val="0"/>
-          <w:numId w:val="2"/>
-        </w:numPr>
+        <w:pStyle w:val="Ttulo2"/>
       </w:pPr>
       <w:r>
         <w:t>CPOE y generación de Lotes para la dispensación</w:t>
@@ -707,12 +648,9 @@
     <w:p>
       <w:pPr>
         <w:pStyle w:val="Ttulo1"/>
-        <w:numPr>
-          <w:ilvl w:val="0"/>
-          <w:numId w:val="2"/>
-        </w:numPr>
-      </w:pPr>
-      <w:r>
+      </w:pPr>
+      <w:r>
+        <w:lastRenderedPageBreak/>
         <w:t>Dosis unitarias enterales</w:t>
       </w:r>
     </w:p>
@@ -732,12 +670,9 @@
     <w:p>
       <w:pPr>
         <w:pStyle w:val="Ttulo1"/>
-        <w:numPr>
-          <w:ilvl w:val="0"/>
-          <w:numId w:val="2"/>
-        </w:numPr>
-      </w:pPr>
-      <w:r>
+      </w:pPr>
+      <w:r>
+        <w:lastRenderedPageBreak/>
         <w:t>Multidosis enterales</w:t>
       </w:r>
     </w:p>
@@ -757,12 +692,9 @@
     <w:p>
       <w:pPr>
         <w:pStyle w:val="Ttulo1"/>
-        <w:numPr>
-          <w:ilvl w:val="0"/>
-          <w:numId w:val="2"/>
-        </w:numPr>
-      </w:pPr>
-      <w:r>
+      </w:pPr>
+      <w:r>
+        <w:lastRenderedPageBreak/>
         <w:t>Medicamentos intravenosos</w:t>
       </w:r>
     </w:p>
@@ -781,13 +713,10 @@
     </w:p>
     <w:p>
       <w:pPr>
-        <w:pStyle w:val="Ttulo1"/>
-        <w:numPr>
-          <w:ilvl w:val="0"/>
-          <w:numId w:val="2"/>
-        </w:numPr>
-      </w:pPr>
-      <w:r>
+        <w:pStyle w:val="Ttulo2"/>
+      </w:pPr>
+      <w:r>
+        <w:lastRenderedPageBreak/>
         <w:t>Nutriciones</w:t>
       </w:r>
     </w:p>
@@ -806,13 +735,10 @@
     </w:p>
     <w:p>
       <w:pPr>
-        <w:pStyle w:val="Ttulo1"/>
-        <w:numPr>
-          <w:ilvl w:val="0"/>
-          <w:numId w:val="2"/>
-        </w:numPr>
-      </w:pPr>
-      <w:r>
+        <w:pStyle w:val="Ttulo2"/>
+      </w:pPr>
+      <w:r>
+        <w:lastRenderedPageBreak/>
         <w:t>Mezclas intravenosas</w:t>
       </w:r>
     </w:p>
@@ -831,13 +757,10 @@
     </w:p>
     <w:p>
       <w:pPr>
-        <w:pStyle w:val="Ttulo1"/>
-        <w:numPr>
-          <w:ilvl w:val="0"/>
-          <w:numId w:val="2"/>
-        </w:numPr>
-      </w:pPr>
-      <w:r>
+        <w:pStyle w:val="Ttulo2"/>
+      </w:pPr>
+      <w:r>
+        <w:lastRenderedPageBreak/>
         <w:t>Nutriciones parenterales</w:t>
       </w:r>
     </w:p>
@@ -856,13 +779,10 @@
     </w:p>
     <w:p>
       <w:pPr>
-        <w:pStyle w:val="Ttulo1"/>
-        <w:numPr>
-          <w:ilvl w:val="0"/>
-          <w:numId w:val="2"/>
-        </w:numPr>
-      </w:pPr>
-      <w:r>
+        <w:pStyle w:val="Ttulo2"/>
+      </w:pPr>
+      <w:r>
+        <w:lastRenderedPageBreak/>
         <w:t>Esquemas de Insulinas</w:t>
       </w:r>
     </w:p>
@@ -890,8 +810,8 @@
       </w:r>
     </w:p>
     <w:sectPr>
-      <w:headerReference w:type="first" r:id="rId14"/>
-      <w:footerReference w:type="first" r:id="rId15"/>
+      <w:headerReference w:type="first" r:id="rId11"/>
+      <w:footerReference w:type="first" r:id="rId12"/>
       <w:pgSz w:w="12240" w:h="15840"/>
       <w:pgMar w:top="1440" w:right="1440" w:bottom="1440" w:left="1440" w:header="708" w:footer="708" w:gutter="0"/>
       <w:pgNumType w:start="1"/>
@@ -928,84 +848,6 @@
 </file>
 
 <file path=word/footer1.xml><?xml version="1.0" encoding="utf-8"?>
-<w:ftr xmlns:wpc="http://schemas.microsoft.com/office/word/2010/wordprocessingCanvas" xmlns:cx="http://schemas.microsoft.com/office/drawing/2014/chartex" xmlns:cx1="http://schemas.microsoft.com/office/drawing/2015/9/8/chartex" xmlns:cx2="http://schemas.microsoft.com/office/drawing/2015/10/21/chartex" xmlns:cx3="http://schemas.microsoft.com/office/drawing/2016/5/9/chartex" xmlns:cx4="http://schemas.microsoft.com/office/drawing/2016/5/10/chartex" xmlns:cx5="http://schemas.microsoft.com/office/drawing/2016/5/11/chartex" xmlns:cx6="http://schemas.microsoft.com/office/drawing/2016/5/12/chartex" xmlns:cx7="http://schemas.microsoft.com/office/drawing/2016/5/13/chartex" xmlns:cx8="http://schemas.microsoft.com/office/drawing/2016/5/14/chartex" xmlns:mc="http://schemas.openxmlformats.org/markup-compatibility/2006" xmlns:aink="http://schemas.microsoft.com/office/drawing/2016/ink" xmlns:am3d="http://schemas.microsoft.com/office/drawing/2017/model3d" xmlns:o="urn:schemas-microsoft-com:office:office" xmlns:oel="http://schemas.microsoft.com/office/2019/extlst" xmlns:r="http://schemas.openxmlformats.org/officeDocument/2006/relationships" xmlns:m="http://schemas.openxmlformats.org/officeDocument/2006/math" xmlns:v="urn:schemas-microsoft-com:vml" xmlns:wp14="http://schemas.microsoft.com/office/word/2010/wordprocessingDrawing" xmlns:wp="http://schemas.openxmlformats.org/drawingml/2006/wordprocessingDrawing" xmlns:w10="urn:schemas-microsoft-com:office:word" xmlns:w="http://schemas.openxmlformats.org/wordprocessingml/2006/main" xmlns:w14="http://schemas.microsoft.com/office/word/2010/wordml" xmlns:w15="http://schemas.microsoft.com/office/word/2012/wordml" xmlns:w16cex="http://schemas.microsoft.com/office/word/2018/wordml/cex" xmlns:w16cid="http://schemas.microsoft.com/office/word/2016/wordml/cid" xmlns:w16="http://schemas.microsoft.com/office/word/2018/wordml" xmlns:w16du="http://schemas.microsoft.com/office/word/2023/wordml/word16du" xmlns:w16sdtdh="http://schemas.microsoft.com/office/word/2020/wordml/sdtdatahash" xmlns:w16sdtfl="http://schemas.microsoft.com/office/word/2024/wordml/sdtformatlock" xmlns:w16se="http://schemas.microsoft.com/office/word/2015/wordml/symex" xmlns:wpg="http://schemas.microsoft.com/office/word/2010/wordprocessingGroup" xmlns:wpi="http://schemas.microsoft.com/office/word/2010/wordprocessingInk" xmlns:wne="http://schemas.microsoft.com/office/word/2006/wordml" xmlns:wps="http://schemas.microsoft.com/office/word/2010/wordprocessingShape" mc:Ignorable="w14 w15 w16se w16cid w16 w16cex w16sdtdh w16sdtfl w16du wp14">
-  <w:sdt>
-    <w:sdtPr>
-      <w:id w:val="748626001"/>
-      <w:docPartObj>
-        <w:docPartGallery w:val="Page Numbers (Bottom of Page)"/>
-        <w:docPartUnique/>
-      </w:docPartObj>
-    </w:sdtPr>
-    <w:sdtContent>
-      <w:p>
-        <w:pPr>
-          <w:pStyle w:val="Piedepgina"/>
-          <w:pBdr>
-            <w:bottom w:val="single" w:sz="6" w:space="1" w:color="auto"/>
-          </w:pBdr>
-        </w:pPr>
-      </w:p>
-      <w:p>
-        <w:pPr>
-          <w:pStyle w:val="Piedepgina"/>
-        </w:pPr>
-        <w:r>
-          <w:t>Centro Médico ABC</w:t>
-        </w:r>
-      </w:p>
-      <w:p>
-        <w:pPr>
-          <w:pStyle w:val="Piedepgina"/>
-          <w:jc w:val="right"/>
-        </w:pPr>
-        <w:r>
-          <w:fldChar w:fldCharType="begin"/>
-        </w:r>
-        <w:r>
-          <w:instrText>PAGE   \* MERGEFORMAT</w:instrText>
-        </w:r>
-        <w:r>
-          <w:fldChar w:fldCharType="separate"/>
-        </w:r>
-        <w:r>
-          <w:rPr>
-            <w:lang w:val="es-ES"/>
-          </w:rPr>
-          <w:t>2</w:t>
-        </w:r>
-        <w:r>
-          <w:fldChar w:fldCharType="end"/>
-        </w:r>
-      </w:p>
-    </w:sdtContent>
-  </w:sdt>
-</w:ftr>
-</file>
-
-<file path=word/footer2.xml><?xml version="1.0" encoding="utf-8"?>
-<w:ftr xmlns:wpc="http://schemas.microsoft.com/office/word/2010/wordprocessingCanvas" xmlns:cx="http://schemas.microsoft.com/office/drawing/2014/chartex" xmlns:cx1="http://schemas.microsoft.com/office/drawing/2015/9/8/chartex" xmlns:cx2="http://schemas.microsoft.com/office/drawing/2015/10/21/chartex" xmlns:cx3="http://schemas.microsoft.com/office/drawing/2016/5/9/chartex" xmlns:cx4="http://schemas.microsoft.com/office/drawing/2016/5/10/chartex" xmlns:cx5="http://schemas.microsoft.com/office/drawing/2016/5/11/chartex" xmlns:cx6="http://schemas.microsoft.com/office/drawing/2016/5/12/chartex" xmlns:cx7="http://schemas.microsoft.com/office/drawing/2016/5/13/chartex" xmlns:cx8="http://schemas.microsoft.com/office/drawing/2016/5/14/chartex" xmlns:mc="http://schemas.openxmlformats.org/markup-compatibility/2006" xmlns:aink="http://schemas.microsoft.com/office/drawing/2016/ink" xmlns:am3d="http://schemas.microsoft.com/office/drawing/2017/model3d" xmlns:o="urn:schemas-microsoft-com:office:office" xmlns:oel="http://schemas.microsoft.com/office/2019/extlst" xmlns:r="http://schemas.openxmlformats.org/officeDocument/2006/relationships" xmlns:m="http://schemas.openxmlformats.org/officeDocument/2006/math" xmlns:v="urn:schemas-microsoft-com:vml" xmlns:wp14="http://schemas.microsoft.com/office/word/2010/wordprocessingDrawing" xmlns:wp="http://schemas.openxmlformats.org/drawingml/2006/wordprocessingDrawing" xmlns:w10="urn:schemas-microsoft-com:office:word" xmlns:w="http://schemas.openxmlformats.org/wordprocessingml/2006/main" xmlns:w14="http://schemas.microsoft.com/office/word/2010/wordml" xmlns:w15="http://schemas.microsoft.com/office/word/2012/wordml" xmlns:w16cex="http://schemas.microsoft.com/office/word/2018/wordml/cex" xmlns:w16cid="http://schemas.microsoft.com/office/word/2016/wordml/cid" xmlns:w16="http://schemas.microsoft.com/office/word/2018/wordml" xmlns:w16du="http://schemas.microsoft.com/office/word/2023/wordml/word16du" xmlns:w16sdtdh="http://schemas.microsoft.com/office/word/2020/wordml/sdtdatahash" xmlns:w16sdtfl="http://schemas.microsoft.com/office/word/2024/wordml/sdtformatlock" xmlns:w16se="http://schemas.microsoft.com/office/word/2015/wordml/symex" xmlns:wpg="http://schemas.microsoft.com/office/word/2010/wordprocessingGroup" xmlns:wpi="http://schemas.microsoft.com/office/word/2010/wordprocessingInk" xmlns:wne="http://schemas.microsoft.com/office/word/2006/wordml" xmlns:wps="http://schemas.microsoft.com/office/word/2010/wordprocessingShape" mc:Ignorable="w14 w15 w16se w16cid w16 w16cex w16sdtdh w16sdtfl w16du wp14">
-  <w:p>
-    <w:pPr>
-      <w:tabs>
-        <w:tab w:val="center" w:pos="4550"/>
-        <w:tab w:val="left" w:pos="5818"/>
-      </w:tabs>
-      <w:ind w:right="260"/>
-      <w:rPr>
-        <w:color w:val="222A35" w:themeColor="text2" w:themeShade="80"/>
-      </w:rPr>
-    </w:pPr>
-  </w:p>
-  <w:p>
-    <w:pPr>
-      <w:pStyle w:val="Piedepgina"/>
-    </w:pPr>
-  </w:p>
-</w:ftr>
-</file>
-
-<file path=word/footer3.xml><?xml version="1.0" encoding="utf-8"?>
 <w:ftr xmlns:wpc="http://schemas.microsoft.com/office/word/2010/wordprocessingCanvas" xmlns:cx="http://schemas.microsoft.com/office/drawing/2014/chartex" xmlns:cx1="http://schemas.microsoft.com/office/drawing/2015/9/8/chartex" xmlns:cx2="http://schemas.microsoft.com/office/drawing/2015/10/21/chartex" xmlns:cx3="http://schemas.microsoft.com/office/drawing/2016/5/9/chartex" xmlns:cx4="http://schemas.microsoft.com/office/drawing/2016/5/10/chartex" xmlns:cx5="http://schemas.microsoft.com/office/drawing/2016/5/11/chartex" xmlns:cx6="http://schemas.microsoft.com/office/drawing/2016/5/12/chartex" xmlns:cx7="http://schemas.microsoft.com/office/drawing/2016/5/13/chartex" xmlns:cx8="http://schemas.microsoft.com/office/drawing/2016/5/14/chartex" xmlns:mc="http://schemas.openxmlformats.org/markup-compatibility/2006" xmlns:aink="http://schemas.microsoft.com/office/drawing/2016/ink" xmlns:am3d="http://schemas.microsoft.com/office/drawing/2017/model3d" xmlns:o="urn:schemas-microsoft-com:office:office" xmlns:oel="http://schemas.microsoft.com/office/2019/extlst" xmlns:r="http://schemas.openxmlformats.org/officeDocument/2006/relationships" xmlns:m="http://schemas.openxmlformats.org/officeDocument/2006/math" xmlns:v="urn:schemas-microsoft-com:vml" xmlns:wp14="http://schemas.microsoft.com/office/word/2010/wordprocessingDrawing" xmlns:wp="http://schemas.openxmlformats.org/drawingml/2006/wordprocessingDrawing" xmlns:w10="urn:schemas-microsoft-com:office:word" xmlns:w="http://schemas.openxmlformats.org/wordprocessingml/2006/main" xmlns:w14="http://schemas.microsoft.com/office/word/2010/wordml" xmlns:w15="http://schemas.microsoft.com/office/word/2012/wordml" xmlns:w16cex="http://schemas.microsoft.com/office/word/2018/wordml/cex" xmlns:w16cid="http://schemas.microsoft.com/office/word/2016/wordml/cid" xmlns:w16="http://schemas.microsoft.com/office/word/2018/wordml" xmlns:w16du="http://schemas.microsoft.com/office/word/2023/wordml/word16du" xmlns:w16sdtdh="http://schemas.microsoft.com/office/word/2020/wordml/sdtdatahash" xmlns:w16sdtfl="http://schemas.microsoft.com/office/word/2024/wordml/sdtformatlock" xmlns:w16se="http://schemas.microsoft.com/office/word/2015/wordml/symex" xmlns:wpg="http://schemas.microsoft.com/office/word/2010/wordprocessingGroup" xmlns:wpi="http://schemas.microsoft.com/office/word/2010/wordprocessingInk" xmlns:wne="http://schemas.microsoft.com/office/word/2006/wordml" xmlns:wps="http://schemas.microsoft.com/office/word/2010/wordprocessingShape" mc:Ignorable="w14 w15 w16se w16cid w16 w16cex w16sdtdh w16sdtfl w16du wp14">
   <w:sdt>
     <w:sdtPr>
@@ -1094,65 +936,13 @@
       <w:pBdr>
         <w:bottom w:val="single" w:sz="6" w:space="1" w:color="auto"/>
       </w:pBdr>
-      <w:tabs>
-        <w:tab w:val="clear" w:pos="9360"/>
-        <w:tab w:val="left" w:pos="5100"/>
-      </w:tabs>
-    </w:pPr>
-    <w:r>
-      <w:fldChar w:fldCharType="begin"/>
-    </w:r>
-    <w:r>
-      <w:instrText xml:space="preserve"> STYLEREF  "Título </w:instrText>
-    </w:r>
-    <w:r>
-      <w:instrText>1</w:instrText>
-    </w:r>
-    <w:r>
-      <w:instrText xml:space="preserve">" </w:instrText>
-    </w:r>
-    <w:r>
-      <w:fldChar w:fldCharType="separate"/>
-    </w:r>
-    <w:r>
-      <w:rPr>
-        <w:noProof/>
-      </w:rPr>
-      <w:t>Dosis unitarias enterales</w:t>
-    </w:r>
-    <w:r>
-      <w:fldChar w:fldCharType="end"/>
-    </w:r>
-    <w:r>
-      <w:t xml:space="preserve"> </w:t>
-    </w:r>
-  </w:p>
-  <w:p>
-    <w:pPr>
-      <w:pStyle w:val="Encabezado"/>
-      <w:pBdr>
-        <w:bottom w:val="single" w:sz="6" w:space="1" w:color="auto"/>
-      </w:pBdr>
-    </w:pPr>
-  </w:p>
-</w:hdr>
-</file>
-
-<file path=word/header2.xml><?xml version="1.0" encoding="utf-8"?>
-<w:hdr xmlns:wpc="http://schemas.microsoft.com/office/word/2010/wordprocessingCanvas" xmlns:cx="http://schemas.microsoft.com/office/drawing/2014/chartex" xmlns:cx1="http://schemas.microsoft.com/office/drawing/2015/9/8/chartex" xmlns:cx2="http://schemas.microsoft.com/office/drawing/2015/10/21/chartex" xmlns:cx3="http://schemas.microsoft.com/office/drawing/2016/5/9/chartex" xmlns:cx4="http://schemas.microsoft.com/office/drawing/2016/5/10/chartex" xmlns:cx5="http://schemas.microsoft.com/office/drawing/2016/5/11/chartex" xmlns:cx6="http://schemas.microsoft.com/office/drawing/2016/5/12/chartex" xmlns:cx7="http://schemas.microsoft.com/office/drawing/2016/5/13/chartex" xmlns:cx8="http://schemas.microsoft.com/office/drawing/2016/5/14/chartex" xmlns:mc="http://schemas.openxmlformats.org/markup-compatibility/2006" xmlns:aink="http://schemas.microsoft.com/office/drawing/2016/ink" xmlns:am3d="http://schemas.microsoft.com/office/drawing/2017/model3d" xmlns:o="urn:schemas-microsoft-com:office:office" xmlns:oel="http://schemas.microsoft.com/office/2019/extlst" xmlns:r="http://schemas.openxmlformats.org/officeDocument/2006/relationships" xmlns:m="http://schemas.openxmlformats.org/officeDocument/2006/math" xmlns:v="urn:schemas-microsoft-com:vml" xmlns:wp14="http://schemas.microsoft.com/office/word/2010/wordprocessingDrawing" xmlns:wp="http://schemas.openxmlformats.org/drawingml/2006/wordprocessingDrawing" xmlns:w10="urn:schemas-microsoft-com:office:word" xmlns:w="http://schemas.openxmlformats.org/wordprocessingml/2006/main" xmlns:w14="http://schemas.microsoft.com/office/word/2010/wordml" xmlns:w15="http://schemas.microsoft.com/office/word/2012/wordml" xmlns:w16cex="http://schemas.microsoft.com/office/word/2018/wordml/cex" xmlns:w16cid="http://schemas.microsoft.com/office/word/2016/wordml/cid" xmlns:w16="http://schemas.microsoft.com/office/word/2018/wordml" xmlns:w16du="http://schemas.microsoft.com/office/word/2023/wordml/word16du" xmlns:w16sdtdh="http://schemas.microsoft.com/office/word/2020/wordml/sdtdatahash" xmlns:w16sdtfl="http://schemas.microsoft.com/office/word/2024/wordml/sdtformatlock" xmlns:w16se="http://schemas.microsoft.com/office/word/2015/wordml/symex" xmlns:wpg="http://schemas.microsoft.com/office/word/2010/wordprocessingGroup" xmlns:wpi="http://schemas.microsoft.com/office/word/2010/wordprocessingInk" xmlns:wne="http://schemas.microsoft.com/office/word/2006/wordml" xmlns:wps="http://schemas.microsoft.com/office/word/2010/wordprocessingShape" mc:Ignorable="w14 w15 w16se w16cid w16 w16cex w16sdtdh w16sdtfl w16du wp14">
-  <w:p>
-    <w:pPr>
-      <w:pStyle w:val="Encabezado"/>
-      <w:pBdr>
-        <w:bottom w:val="single" w:sz="6" w:space="1" w:color="auto"/>
-      </w:pBdr>
     </w:pPr>
     <w:fldSimple w:instr=" STYLEREF  &quot;Título 1&quot;  \* MERGEFORMAT ">
       <w:r>
         <w:rPr>
           <w:noProof/>
         </w:rPr>
-        <w:t>Introducción</w:t>
+        <w:t>Medicamentos intravenosos</w:t>
       </w:r>
     </w:fldSimple>
   </w:p>
@@ -1758,7 +1548,7 @@
     <w:link w:val="Ttulo1Car"/>
     <w:uiPriority w:val="9"/>
     <w:qFormat/>
-    <w:rsid w:val="005B7203"/>
+    <w:rsid w:val="00521FE9"/>
     <w:pPr>
       <w:keepNext/>
       <w:keepLines/>
@@ -1767,8 +1557,9 @@
     </w:pPr>
     <w:rPr>
       <w:rFonts w:asciiTheme="majorHAnsi" w:eastAsiaTheme="majorEastAsia" w:hAnsiTheme="majorHAnsi" w:cstheme="majorBidi"/>
+      <w:b/>
       <w:color w:val="2F5496" w:themeColor="accent1" w:themeShade="BF"/>
-      <w:sz w:val="40"/>
+      <w:sz w:val="52"/>
       <w:szCs w:val="40"/>
     </w:rPr>
   </w:style>
@@ -1800,7 +1591,6 @@
     <w:next w:val="Normal"/>
     <w:link w:val="Ttulo3Car"/>
     <w:uiPriority w:val="9"/>
-    <w:semiHidden/>
     <w:unhideWhenUsed/>
     <w:qFormat/>
     <w:rsid w:val="005B7203"/>
@@ -1952,6 +1742,7 @@
   <w:style w:type="character" w:default="1" w:styleId="Fuentedeprrafopredeter">
     <w:name w:val="Default Paragraph Font"/>
     <w:uiPriority w:val="1"/>
+    <w:semiHidden/>
     <w:unhideWhenUsed/>
   </w:style>
   <w:style w:type="table" w:default="1" w:styleId="Tablanormal">
@@ -2159,11 +1950,12 @@
     <w:basedOn w:val="Fuentedeprrafopredeter"/>
     <w:link w:val="Ttulo1"/>
     <w:uiPriority w:val="9"/>
-    <w:rsid w:val="005B7203"/>
+    <w:rsid w:val="00521FE9"/>
     <w:rPr>
       <w:rFonts w:asciiTheme="majorHAnsi" w:eastAsiaTheme="majorEastAsia" w:hAnsiTheme="majorHAnsi" w:cstheme="majorBidi"/>
+      <w:b/>
       <w:color w:val="2F5496" w:themeColor="accent1" w:themeShade="BF"/>
-      <w:sz w:val="40"/>
+      <w:sz w:val="52"/>
       <w:szCs w:val="40"/>
     </w:rPr>
   </w:style>
@@ -2185,7 +1977,6 @@
     <w:basedOn w:val="Fuentedeprrafopredeter"/>
     <w:link w:val="Ttulo3"/>
     <w:uiPriority w:val="9"/>
-    <w:semiHidden/>
     <w:rsid w:val="005B7203"/>
     <w:rPr>
       <w:rFonts w:eastAsiaTheme="majorEastAsia" w:cstheme="majorBidi"/>
@@ -2396,13 +2187,12 @@
   </w:style>
   <w:style w:type="paragraph" w:styleId="Citadestacada">
     <w:name w:val="Intense Quote"/>
-    <w:aliases w:val="Politica"/>
     <w:basedOn w:val="Normal"/>
     <w:next w:val="Normal"/>
     <w:link w:val="CitadestacadaCar"/>
     <w:uiPriority w:val="30"/>
     <w:qFormat/>
-    <w:rsid w:val="00DA265B"/>
+    <w:rsid w:val="00E870E9"/>
     <w:pPr>
       <w:pBdr>
         <w:top w:val="dashSmallGap" w:sz="4" w:space="10" w:color="404040" w:themeColor="text1" w:themeTint="BF"/>
@@ -2421,11 +2211,10 @@
   </w:style>
   <w:style w:type="character" w:customStyle="1" w:styleId="CitadestacadaCar">
     <w:name w:val="Cita destacada Car"/>
-    <w:aliases w:val="Politica Car"/>
     <w:basedOn w:val="Fuentedeprrafopredeter"/>
     <w:link w:val="Citadestacada"/>
     <w:uiPriority w:val="30"/>
-    <w:rsid w:val="00DA265B"/>
+    <w:rsid w:val="00E870E9"/>
     <w:rPr>
       <w:iCs/>
       <w:color w:val="000000" w:themeColor="text1"/>
@@ -2562,7 +2351,7 @@
     <w:basedOn w:val="Fuentedeprrafopredeter"/>
     <w:uiPriority w:val="19"/>
     <w:qFormat/>
-    <w:rsid w:val="006C7F76"/>
+    <w:rsid w:val="006A0315"/>
     <w:rPr>
       <w:i/>
       <w:iCs/>
@@ -2803,6 +2592,50 @@
       <w:color w:val="954F72" w:themeColor="followedHyperlink"/>
       <w:u w:val="single"/>
     </w:rPr>
+  </w:style>
+  <w:style w:type="character" w:styleId="nfasis">
+    <w:name w:val="Emphasis"/>
+    <w:basedOn w:val="Fuentedeprrafopredeter"/>
+    <w:uiPriority w:val="20"/>
+    <w:qFormat/>
+    <w:rsid w:val="00801B8C"/>
+    <w:rPr>
+      <w:i/>
+      <w:iCs/>
+    </w:rPr>
+  </w:style>
+  <w:style w:type="paragraph" w:customStyle="1" w:styleId="Politica">
+    <w:name w:val="Politica"/>
+    <w:basedOn w:val="Citadestacada"/>
+    <w:link w:val="PoliticaCar"/>
+    <w:qFormat/>
+    <w:rsid w:val="00E870E9"/>
+  </w:style>
+  <w:style w:type="character" w:customStyle="1" w:styleId="PoliticaCar">
+    <w:name w:val="Politica Car"/>
+    <w:basedOn w:val="CitadestacadaCar"/>
+    <w:link w:val="Politica"/>
+    <w:rsid w:val="00E870E9"/>
+    <w:rPr>
+      <w:iCs/>
+      <w:color w:val="000000" w:themeColor="text1"/>
+    </w:rPr>
+  </w:style>
+  <w:style w:type="paragraph" w:customStyle="1" w:styleId="Nota">
+    <w:name w:val="Nota"/>
+    <w:basedOn w:val="Normal"/>
+    <w:link w:val="NotaCar"/>
+    <w:qFormat/>
+    <w:rsid w:val="00E870E9"/>
+    <w:pPr>
+      <w:jc w:val="right"/>
+    </w:pPr>
+  </w:style>
+  <w:style w:type="character" w:customStyle="1" w:styleId="NotaCar">
+    <w:name w:val="Nota Car"/>
+    <w:basedOn w:val="Fuentedeprrafopredeter"/>
+    <w:link w:val="Nota"/>
+    <w:rsid w:val="00E870E9"/>
   </w:style>
 </w:styles>
 </file>

</xml_diff>